<commit_message>
fix: close three術 review and release regressions
</commit_message>
<xml_diff>
--- a/docs/PROJECT_REVIEW_HANDOFF_20260908.docx
+++ b/docs/PROJECT_REVIEW_HANDOFF_20260908.docx
@@ -40,7 +40,7 @@
           <w:rFonts w:ascii="Microsoft YaHei" w:hAnsi="Microsoft YaHei" w:eastAsia="Microsoft YaHei"/>
           <w:sz w:val="21"/>
         </w:rPr>
-        <w:t>本文记录本轮将观象命盘从技术 RC 补到本地排盘、证据、解释、保存、历史查看和事实反馈闭环的结果。基础规则计算仍在设备本地，未接入广告、支付、云同步、真实身份供应商或生产 AI。</w:t>
+        <w:t>本文记录本轮将观象命盘从技术 RC 补到本地排盘、证据、解释、保存、历史查看和事实反馈闭环的结果。八字、六爻、紫微三术都有保存时的结构化盘面、规则版本和解释快照。基础规则计算仍在设备本地，未接入广告、支付、云同步、真实身份供应商或生产 AI。</w:t>
       </w:r>
     </w:p>
     <w:p>
@@ -52,7 +52,7 @@
           <w:rFonts w:ascii="Microsoft YaHei" w:hAnsi="Microsoft YaHei" w:eastAsia="Microsoft YaHei"/>
           <w:sz w:val="21"/>
         </w:rPr>
-        <w:t>结论：R01–R10 的可在当前仓库完成部分已经实现并经过本地回归；正式公开发布仍受真机与签名、主体与商店合规、城市数据许可、传统术数专业复核和 Qwen 离线评测阻塞。</w:t>
+        <w:t>结论：当前仓库可完成的 R01–R10 已实现并经过本地回归；正式公开发布仍受真机与签名、主体与商店合规、城市数据许可、传统术数专业复核、生产依赖漏洞处置和 Qwen 离线评测阻塞。</w:t>
       </w:r>
     </w:p>
     <w:p>
@@ -77,7 +77,7 @@
           <w:rFonts w:ascii="Microsoft YaHei" w:hAnsi="Microsoft YaHei" w:eastAsia="Microsoft YaHei"/>
           <w:sz w:val="21"/>
         </w:rPr>
-        <w:t>本轮交付提交为 770d036729900572d06308079c5ffd3d4ec47acd，基于远端 main 3572de2 合入后推送。GitHub Actions 新 run 34201638220 与该提交绑定，真实结论为 success；该 CI 中 Web Export 与 Verify Web Export 均实际执行，不能复用旧 run 33768014467。</w:t>
+        <w:t>本轮已生成本地提交，当前尚未推送远端；具体 SHA 以最终 git rev-parse HEAD 记录为准。当前不能声称本轮 GitHub Actions 为绿色，也不引用旧 run 作为本轮证据。推送后必须检查该 SHA 对应的 Actions，确认 Web Export 与 Verify Web Export 实际执行并成功。</w:t>
       </w:r>
     </w:p>
     <w:p>
@@ -105,6 +105,9 @@
         <w:gridCol w:w="8496"/>
       </w:tblGrid>
       <w:tr>
+        <w:trPr>
+          <w:tblHeader w:val="true"/>
+        </w:trPr>
         <w:tc>
           <w:tcPr>
             <w:tcW w:type="dxa" w:w="792"/>
@@ -734,7 +737,7 @@
                 <w:color w:val="000000"/>
                 <w:sz w:val="17"/>
               </w:rPr>
-              <w:t>八字保留八层解释、证据链、候选取用和未知时辰 fail-closed；大运/流年深度事实引擎仍待专业规则确认。</w:t>
+              <w:t>八字保留主题、条件、反证、候选取用、证据链和未知时辰 fail-closed；大运/流年深度事实引擎仍待专业规则确认。</w:t>
             </w:r>
           </w:p>
         </w:tc>
@@ -794,7 +797,7 @@
                 <w:color w:val="000000"/>
                 <w:sz w:val="17"/>
               </w:rPr>
-              <w:t>完成</w:t>
+              <w:t>完成 基础规则</w:t>
             </w:r>
           </w:p>
         </w:tc>
@@ -823,7 +826,7 @@
                 <w:color w:val="000000"/>
                 <w:sz w:val="17"/>
               </w:rPr>
-              <w:t>六爻支持快捷自动、六次交互、手工录入；保留用神、世应、旺衰、动变与反馈，不承诺具体应期。</w:t>
+              <w:t>六爻支持快捷自动、六次三枚铜钱投掷、手工录入；实现 1:3:3:1 的 6/7/8/9 规则，保留用神、世应、旺衰、动变和变后事实，不承诺确定应期。</w:t>
             </w:r>
           </w:p>
         </w:tc>
@@ -885,7 +888,7 @@
                 <w:color w:val="000000"/>
                 <w:sz w:val="17"/>
               </w:rPr>
-              <w:t>完成 基础</w:t>
+              <w:t>完成 基础深度</w:t>
             </w:r>
           </w:p>
         </w:tc>
@@ -915,7 +918,7 @@
                 <w:color w:val="000000"/>
                 <w:sz w:val="17"/>
               </w:rPr>
-              <w:t>紫微十二宫、对宫/三方、四化节点和逐宫查看可用；占星支持全量相位与日级近似边界。</w:t>
+              <w:t>紫微十二宫、命身定位、主星/亮度、四化、对宫/三方四正节点可回查；占星支持全量相位与日级近似边界。</w:t>
             </w:r>
           </w:p>
         </w:tc>
@@ -1004,7 +1007,7 @@
                 <w:color w:val="000000"/>
                 <w:sz w:val="17"/>
               </w:rPr>
-              <w:t>历史使用保存时 payload 和只读 ChartRenderer；反馈自动关联首个解读/依据，不静默重算历史。</w:t>
+              <w:t>实时页和历史页复用只读 ChartRenderer；旧记录缺数组时安全降级不重算；反馈默认不关联，用户选择具体解读卡及其相关证据并保持导入导出关联。</w:t>
             </w:r>
           </w:p>
         </w:tc>
@@ -1096,7 +1099,7 @@
                 <w:color w:val="000000"/>
                 <w:sz w:val="17"/>
               </w:rPr>
-              <w:t>安全扫描、生产 audit、Web 10 路由导出和验证已收口；真机、证书、主体、许可与线上部署仍阻塞。</w:t>
+              <w:t>安全扫描、生产 audit、Web 14 路由导出、四模块深链和 Service Worker 缓存迁移已收口；真机、证书、主体、许可与线上部署仍阻塞。</w:t>
             </w:r>
           </w:p>
         </w:tc>
@@ -1185,7 +1188,7 @@
                 <w:color w:val="000000"/>
                 <w:sz w:val="17"/>
               </w:rPr>
-              <w:t>Qwen3.5-9B 只形成脱敏离线评测方案，不接生产、不上传真实档案；权重和人工评测未执行。</w:t>
+              <w:t>Qwen3.5-9B 只形成脱敏离线评测方案，不接生产、不上传真实档案、不购买算力；权重和人工评测未执行。</w:t>
             </w:r>
           </w:p>
         </w:tc>
@@ -1323,7 +1326,7 @@
           <w:rFonts w:ascii="Microsoft YaHei" w:hAnsi="Microsoft YaHei" w:eastAsia="Microsoft YaHei"/>
           <w:sz w:val="21"/>
         </w:rPr>
-        <w:t>首页 → 命主 → 八字 → 选择性别、日界线、真太阳时 → 排出四柱 → 展开深度判断和本次计算依据 → 保存到记录 → 记录页打开保存时完整盘面、解释和事实反馈。未知时辰不补造时柱；候选取用只作为待复核入口。</w:t>
+        <w:t>首页 → 命主 → 八字 → 选择性别、日界线、真太阳时 → 排出四柱 → 查看主题判断、条件/反证、候选取用和计算依据 → 保存到记录 → 记录页打开保存时完整盘面、解释和事实反馈。未知时辰不补造时柱，也不把大运/流年缺失事实写成确定结论。</w:t>
       </w:r>
     </w:p>
     <w:p>
@@ -1348,7 +1351,7 @@
           <w:rFonts w:ascii="Microsoft YaHei" w:hAnsi="Microsoft YaHei" w:eastAsia="Microsoft YaHei"/>
           <w:sz w:val="21"/>
         </w:rPr>
-        <w:t>首页 → 六爻 → 输入至少 4 字问题 → 选择用神方向 → 选择快捷自动、六次投掷或手工录入 → 逐条检查爻位、世应、旺衰、动静和 6/7/8/9 点 → 生成解释并保存。保存失败时点击重试保存原卦，不会重新随机。</w:t>
+        <w:t>首页 → 六爻 → 输入至少 4 字问题 → 选择用神方向 → 选择快捷自动、六次三枚铜钱投掷或手工录入 → 逐条检查爻位、世应、旺衰、动静、纳甲和 6/7/8/9 点 → 生成解释并保存。保存失败时点击重试保存原卦，不会重新随机。</w:t>
       </w:r>
     </w:p>
     <w:p>
@@ -1373,7 +1376,7 @@
           <w:rFonts w:ascii="Microsoft YaHei" w:hAnsi="Microsoft YaHei" w:eastAsia="Microsoft YaHei"/>
           <w:sz w:val="21"/>
         </w:rPr>
-        <w:t>首页 → 紫微 → 生成十二宫 → 点击宫位查看主星、对宫和三方 → 展开四化和主题解释 → 记录页查看保存时完整十二宫。命宫文案改为命宫定位，不再输出命宫落在命宫。</w:t>
+        <w:t>首页 → 紫微 → 生成十二宫 → 点击宫位查看主星、亮度、命身定位、对宫和三方四正 → 展开四化和主题解释 → 记录页查看保存时完整十二宫。命宫文案使用真实干支坐标，不再输出无信息的命宫落在命宫。</w:t>
       </w:r>
     </w:p>
     <w:p>
@@ -1398,7 +1401,7 @@
           <w:rFonts w:ascii="Microsoft YaHei" w:hAnsi="Microsoft YaHei" w:eastAsia="Microsoft YaHei"/>
           <w:sz w:val="21"/>
         </w:rPr>
-        <w:t>首页 → 星盘 → 生成本命盘 → 查看全部行星、宫位和相位；未知时辰只展示通过全天稳定性检查的日级落座。历史页只读保存时结果，修订规则需要用户主动运行当前规则复核并生成 Diff。</w:t>
+        <w:t>首页 → 星盘 → 生成本命盘 → 查看全部星体、宫位和相位；未知时辰只展示通过全天稳定性检查的日级落座。历史页只读保存时结果，修订规则需要用户主动运行当前规则复核并生成 Diff。</w:t>
       </w:r>
     </w:p>
     <w:p>
@@ -1463,6 +1466,9 @@
         <w:gridCol w:w="6192"/>
       </w:tblGrid>
       <w:tr>
+        <w:trPr>
+          <w:tblHeader w:val="true"/>
+        </w:trPr>
         <w:tc>
           <w:tcPr>
             <w:tcW w:type="dxa" w:w="2448"/>
@@ -1609,7 +1615,7 @@
                 <w:color w:val="000000"/>
                 <w:sz w:val="17"/>
               </w:rPr>
-              <w:t>通过 221/221，0 失败，0 跳过</w:t>
+              <w:t>通过 239/239，0 失败，0 跳过</w:t>
             </w:r>
           </w:p>
         </w:tc>
@@ -1638,7 +1644,7 @@
                 <w:color w:val="000000"/>
                 <w:sz w:val="17"/>
               </w:rPr>
-              <w:t>含 R01 storage、R02 语义引用、R03 指纹、R05 六爻手工事实、R06 紫微关系回归</w:t>
+              <w:t>含六爻三枚铜钱、旧档案 render、反馈关联、R01 storage、R02 语义引用、R03 指纹和 R06 紫微关系回归</w:t>
             </w:r>
           </w:p>
         </w:tc>
@@ -1911,7 +1917,7 @@
                 <w:color w:val="000000"/>
                 <w:sz w:val="17"/>
               </w:rPr>
-              <w:t>真实导出 10 个静态路由</w:t>
+              <w:t>真实导出 14 个静态路由，含四模块具体深链</w:t>
             </w:r>
           </w:p>
         </w:tc>
@@ -2000,7 +2006,7 @@
                 <w:color w:val="000000"/>
                 <w:sz w:val="17"/>
               </w:rPr>
-              <w:t>10 routes、公共发布文件和 bundle 验证通过</w:t>
+              <w:t>14 routes、公共发布文件、bundle、深链和 SW 迁移验证通过</w:t>
             </w:r>
           </w:p>
         </w:tc>
@@ -2293,7 +2299,7 @@
           <w:rFonts w:ascii="Microsoft YaHei" w:hAnsi="Microsoft YaHei" w:eastAsia="Microsoft YaHei"/>
           <w:sz w:val="21"/>
         </w:rPr>
-        <w:t>生产漏洞主要来自 Expo、Metro、Router、xcode 等传递依赖。本轮逐项记录了可达性和 SDK 57 兼容性，没有执行 npm audit fix --force。</w:t>
+        <w:t>生产漏洞主要来自 Expo、Metro、Router、xcode 等传递依赖。本轮逐项记录了可达性和 SDK 57 兼容性，没有执行 npm audit fix --force，也没有把漏洞白名单当作清零。</w:t>
       </w:r>
     </w:p>
     <w:p>
@@ -2383,7 +2389,7 @@
           <w:rFonts w:ascii="Microsoft YaHei" w:hAnsi="Microsoft YaHei" w:eastAsia="Microsoft YaHei"/>
           <w:sz w:val="19"/>
         </w:rPr>
-        <w:t>八字大运/流年、紫微流派与四化、六爻传统规则需要专业审核和可引用来源。</w:t>
+        <w:t>八字大运/流年、紫微流派与四化、六爻细分规则需要专业审核和可引用来源。</w:t>
       </w:r>
     </w:p>
     <w:p>
@@ -2434,7 +2440,7 @@
           <w:rFonts w:ascii="Microsoft YaHei" w:hAnsi="Microsoft YaHei" w:eastAsia="Microsoft YaHei"/>
           <w:sz w:val="21"/>
         </w:rPr>
-        <w:t>工程交接：docs/PROJECT_REVIEW_HANDOFF_20260908.md。生产依赖审计：docs/PRODUCTION_AUDIT_20260908.md。Qwen 离线方案：docs/QWEN35_9B_OFFLINE_EVAL_PLAN_20260908.md。源代码、测试和 CI 配置以提交 770d036729900572d06308079c5ffd3d4ec47acd 为准。</w:t>
+        <w:t>工程交接：docs/PROJECT_REVIEW_HANDOFF_20260908.md。生产依赖审计：docs/PRODUCTION_AUDIT_20260908.md。Qwen 离线方案：docs/QWEN35_9B_OFFLINE_EVAL_PLAN_20260908.md。本轮本地提交尚未推送远端；CI run 和最终验收以本轮实际记录为准。</w:t>
       </w:r>
     </w:p>
     <w:sectPr>

</xml_diff>